<commit_message>
Minor revisions to Technical Report
</commit_message>
<xml_diff>
--- a/submission/MLOps_Technical_Report.docx
+++ b/submission/MLOps_Technical_Report.docx
@@ -197,11 +197,40 @@
             <w:vAlign w:val="center"/>
           </w:tcPr>
           <w:p>
+            <w:pPr>
+              <w:rPr>
+                <w:sz w:val="19"/>
+              </w:rPr>
+            </w:pPr>
             <w:r>
               <w:rPr>
                 <w:sz w:val="19"/>
               </w:rPr>
               <w:t>Dr. Alka Bhushan, Dr. Priyanka, Dr. Aishwarya</w:t>
+            </w:r>
+            <w:r>
+              <w:rPr>
+                <w:sz w:val="19"/>
+              </w:rPr>
+              <w:br/>
+            </w:r>
+            <w:r>
+              <w:rPr>
+                <w:sz w:val="19"/>
+              </w:rPr>
+              <w:t>Jashaswimalya Acharjee</w:t>
+            </w:r>
+            <w:r>
+              <w:rPr>
+                <w:sz w:val="19"/>
+              </w:rPr>
+              <w:br/>
+            </w:r>
+            <w:r>
+              <w:rPr>
+                <w:sz w:val="19"/>
+              </w:rPr>
+              <w:t>Sankalp Shrivastava</w:t>
             </w:r>
           </w:p>
         </w:tc>
@@ -272,21 +301,7 @@
                 <w:sz w:val="19"/>
               </w:rPr>
               <w:br/>
-              <w:t xml:space="preserve">Sarita </w:t>
-            </w:r>
-            <w:proofErr w:type="spellStart"/>
-            <w:r>
-              <w:rPr>
-                <w:sz w:val="19"/>
-              </w:rPr>
-              <w:t>Jangra</w:t>
-            </w:r>
-            <w:proofErr w:type="spellEnd"/>
-            <w:r>
-              <w:rPr>
-                <w:sz w:val="19"/>
-              </w:rPr>
-              <w:t xml:space="preserve"> – DA25M617</w:t>
+              <w:t>Sarita Jangra – DA25M617</w:t>
             </w:r>
           </w:p>
         </w:tc>
@@ -2334,15 +2349,7 @@
         <w:t>The implementation satisfies the scope</w:t>
       </w:r>
       <w:r>
-        <w:t xml:space="preserve"> mentioned in the project </w:t>
-      </w:r>
-      <w:proofErr w:type="spellStart"/>
-      <w:r>
-        <w:t>specfication</w:t>
-      </w:r>
-      <w:proofErr w:type="spellEnd"/>
-      <w:r>
-        <w:t xml:space="preserve">. </w:t>
+        <w:t xml:space="preserve"> mentioned in the project specfication. </w:t>
       </w:r>
       <w:r>
         <w:t>Airflow orchestration, Kafka and Spark data engineering, reproducible preprocessing, two-model comparison, MLflow tracking/registry, DVC versioning, Dockerized FastAPI deployment, monitoring/logging/drift, and GitHub Actions CI/CD. The architecture is deliberately local-first so it can be demonstrated and reproduced without paid cloud infrastructure.</w:t>
@@ -2652,23 +2659,13 @@
     <w:pPr>
       <w:pStyle w:val="Header"/>
     </w:pPr>
-    <w:proofErr w:type="spellStart"/>
     <w:r>
       <w:rPr>
         <w:b/>
         <w:color w:val="666666"/>
         <w:sz w:val="17"/>
       </w:rPr>
-      <w:t>MLOps</w:t>
-    </w:r>
-    <w:proofErr w:type="spellEnd"/>
-    <w:r>
-      <w:rPr>
-        <w:b/>
-        <w:color w:val="666666"/>
-        <w:sz w:val="17"/>
-      </w:rPr>
-      <w:t xml:space="preserve"> Technical Report</w:t>
+      <w:t>MLOps Technical Report</w:t>
     </w:r>
   </w:p>
 </w:hdr>
@@ -3486,7 +3483,6 @@
   <w:style w:type="character" w:default="1" w:styleId="DefaultParagraphFont">
     <w:name w:val="Default Paragraph Font"/>
     <w:uiPriority w:val="1"/>
-    <w:semiHidden/>
     <w:unhideWhenUsed/>
   </w:style>
   <w:style w:type="table" w:default="1" w:styleId="TableNormal">

</xml_diff>

<commit_message>
Add demo submission materials
</commit_message>
<xml_diff>
--- a/submission/MLOps_Technical_Report.docx
+++ b/submission/MLOps_Technical_Report.docx
@@ -280,6 +280,25 @@
               <w:rPr>
                 <w:sz w:val="19"/>
               </w:rPr>
+              <w:t>Belhe Rohan Shirish</w:t>
+            </w:r>
+            <w:r>
+              <w:rPr>
+                <w:sz w:val="19"/>
+              </w:rPr>
+              <w:t xml:space="preserve"> – DA25M5</w:t>
+            </w:r>
+            <w:r>
+              <w:rPr>
+                <w:sz w:val="19"/>
+              </w:rPr>
+              <w:t>55</w:t>
+            </w:r>
+            <w:r>
+              <w:rPr>
+                <w:sz w:val="19"/>
+              </w:rPr>
+              <w:br/>
               <w:t>Gutti Ashok Kumar – DA25M567</w:t>
             </w:r>
             <w:r>
@@ -287,7 +306,18 @@
                 <w:sz w:val="19"/>
               </w:rPr>
               <w:br/>
-              <w:t>K Afsar Ali – DA25M617</w:t>
+            </w:r>
+            <w:r>
+              <w:rPr>
+                <w:sz w:val="19"/>
+              </w:rPr>
+              <w:t>K Afsar Ali – DA25M</w:t>
+            </w:r>
+            <w:r>
+              <w:rPr>
+                <w:sz w:val="19"/>
+              </w:rPr>
+              <w:t>535</w:t>
             </w:r>
             <w:r>
               <w:rPr>
@@ -3483,6 +3513,7 @@
   <w:style w:type="character" w:default="1" w:styleId="DefaultParagraphFont">
     <w:name w:val="Default Paragraph Font"/>
     <w:uiPriority w:val="1"/>
+    <w:semiHidden/>
     <w:unhideWhenUsed/>
   </w:style>
   <w:style w:type="table" w:default="1" w:styleId="TableNormal">

</xml_diff>